<commit_message>
Marilyn Monroe: ajuste final de extensão
Co-Authored-By: Claude Opus 5.5 <noreply@anthropic.com>
Claude-Session: https://claude.ai/code/session_01MJjUEEZrxQDEUifKK2vj9g
</commit_message>
<xml_diff>
--- a/roteiros/marilyn-monroe/MarilynMonroe_Roteiro_Completo.docx
+++ b/roteiros/marilyn-monroe/MarilynMonroe_Roteiro_Completo.docx
@@ -1543,7 +1543,7 @@
         <w:rPr>
           <w:color w:val="000000"/>
         </w:rPr>
-        <w:t>O caso ficou conhecido como "a invasão da porta errada". A mulher processou os envolvidos e fechou um acordo.</w:t>
+        <w:t>O caso ficou conhecido como "a invasão da porta errada". DiMaggio e Sinatra sempre negaram ter entrado no apartamento. Disseram que ficaram esperando do lado de fora. A mulher processou os envolvidos e fechou um acordo.</w:t>
       </w:r>
     </w:p>
     <w:p>
@@ -2695,7 +2695,7 @@
         <w:rPr>
           <w:color w:val="000000"/>
         </w:rPr>
-        <w:t>Snyder cumpriu a promessa.</w:t>
+        <w:t>Snyder cumpriu a promessa. Marilyn foi enterrada com um vestido verde-claro, num caixão de bronze forrado de cetim.</w:t>
       </w:r>
     </w:p>
     <w:p>

</xml_diff>